<commit_message>
Strengthen Related Work (Section 2) comparative analysis and cover letter
- Section 2: Added deeper gap analysis in each subsection (2.1-2.5)
  identifying specific limitations of existing approaches that TATSUKI addresses
- Section 2.3: Expanded QV, liquid democracy, futarchy, Democratic AI comparisons
  with explicit analysis of what each leaves unresolved
- Section 2.6: New Comparative Summary subsection with Table 1
  (7 dimensions x 6 approaches structured comparison)
- Cover letter: Added 'why this paper is needed now' argument
  (trust decline, pledge tracking maturity, computational methods)
- Cover letter: Added comparative positioning paragraph referencing Table 1
- Cover letter: Added contribution (v) systematic comparative analysis

Co-Authored-By: Tatsuki Onishi <bougtoir@gmail.com>
</commit_message>
<xml_diff>
--- a/tasuki-electoral-model/output/docx/TATSUKI_SSR_English.docx
+++ b/tasuki-electoral-model/output/docx/TATSUKI_SSR_English.docx
@@ -162,6 +162,11 @@
       </w:r>
     </w:p>
     <w:p>
+      <w:r>
+        <w:t>This section reviews five strands of literature that converge in the TATSUKI proposal: retrospective voting theory, mechanism design, alternative electoral reforms, campaign pledge fulfillment empirics, and agent-based models of elections. For each strand, we identify specific theoretical or methodological gaps that TATSUKI is designed to address. Section 2.6 synthesizes these comparisons in a structured summary.</w:t>
+      </w:r>
+    </w:p>
+    <w:p>
       <w:pPr>
         <w:pStyle w:val="Heading2"/>
       </w:pPr>
@@ -171,12 +176,12 @@
     </w:p>
     <w:p>
       <w:r>
-        <w:t>The retrospective voting tradition, initiated by Key (1966) and formalized by Fiorina (1981), posits that voters evaluate incumbents based on past performance rather than prospective policy promises. Healy and Malhotra (2013) provide a comprehensive review, noting that voters are often myopic, weighting recent events disproportionately, and susceptible to irrelevant factors. TATSUKI addresses these limitations by institutionalizing the retrospective evaluation process, replacing subjective voter assessments with structured third-party evaluation of pre-declared pledges.</w:t>
+        <w:t>The retrospective voting tradition, initiated by Key (1966) and formalized by Fiorina (1981), posits that voters evaluate incumbents based on past performance rather than prospective policy promises. Healy and Malhotra (2013) provide a comprehensive review, noting that voters are often myopic, weighting recent events disproportionately, and susceptible to irrelevant factors. These systematic biases constitute a fundamental limitation: retrospective voting theory assumes that voters perform the evaluation function, yet extensive evidence shows they do so poorly. TATSUKI addresses this gap by institutionalizing the retrospective evaluation process, replacing subjective voter assessments with structured third-party evaluation of pre-declared pledges. The evaluation is thereby decoupled from voter cognition, mitigating myopia and irrelevant-factor contamination.</w:t>
       </w:r>
     </w:p>
     <w:p>
       <w:r>
-        <w:t>Formal models of electoral accountability, notably Barro (1973) and Ferejohn (1986), frame the voter-politician relationship as a principal-agent problem. In these models, voters employ threshold strategies: re-elect the incumbent if performance exceeds a reservation utility, otherwise remove. Besley (2006) extends this framework to distinguish selection and disciplining effects. TATSUKI generalizes the binary sanction of these models into a continuous trust coefficient τ = ω(S), providing finer-grained incentives for policy fulfillment.</w:t>
+        <w:t>Formal models of electoral accountability, notably Barro (1973) and Ferejohn (1986), frame the voter-politician relationship as a principal-agent problem. In these models, voters employ threshold strategies: re-elect the incumbent if performance exceeds a reservation utility, otherwise remove. Besley (2006) extends this framework to distinguish selection and disciplining effects. However, all these models share a critical structural limitation: the sanction is binary (re-election vs. removal), and the evaluation criteria are implicit and unverifiable. There is no mechanism for candidates to pre-commit to specific deliverables, nor for voters to calibrate sanctions proportionally to fulfillment. TATSUKI generalizes the binary sanction into a continuous trust coefficient τ = ω(S), providing finer-grained incentives, and introduces explicit pledge declaration to make the principal-agent contract observable and verifiable.</w:t>
       </w:r>
     </w:p>
     <w:p>
@@ -189,12 +194,12 @@
     </w:p>
     <w:p>
       <w:r>
-        <w:t>Arrow's impossibility theorem (Arrow, 1951) and the Gibbard-Satterthwaite theorem (Gibbard, 1973; Satterthwaite, 1975) establish fundamental limits on ranked-choice voting systems. Dasgupta and Maskin (2020) provide recent results on strategy-proofness under majority rule. TATSUKI does not modify the preference aggregation rule itself but introduces an additional dimension—dynamic trust weighting—that operates upstream of the aggregation step. This situates TATSUKI outside the direct scope of classical impossibility results, though it raises new questions about strategic manipulation in the pledge-declaration and evaluation stages.</w:t>
+        <w:t>Arrow's impossibility theorem (Arrow, 1951) and the Gibbard-Satterthwaite theorem (Gibbard, 1973; Satterthwaite, 1975) establish fundamental limits on ranked-choice voting systems. Dasgupta and Maskin (2020) provide recent results on strategy-proofness under majority rule. These classical results constrain the design space for preference aggregation rules, but they are silent on mechanisms that operate on a different dimension: post-election performance feedback. TATSUKI does not modify the preference aggregation rule itself but introduces an additional dimension—dynamic trust weighting—that operates upstream of the aggregation step. This situates TATSUKI outside the direct scope of classical impossibility results, though it raises new questions about strategic manipulation in the pledge-declaration and evaluation stages.</w:t>
       </w:r>
     </w:p>
     <w:p>
       <w:r>
-        <w:t>Acemoglu, Golosov, and Tsyvinski (2008) study the political economy of mechanisms, analyzing dynamic incentive provision for politicians. Their framework informs our treatment of intertemporal incentives, though TATSUKI differs in making the incentive structure transparent and parameterized through the publicly known influence function ω(S).</w:t>
+        <w:t>Acemoglu, Golosov, and Tsyvinski (2008) study the political economy of mechanisms, analyzing dynamic incentive provision for politicians. Their framework provides the closest theoretical antecedent to TATSUKI's intertemporal incentive structure. However, their analysis assumes that the mechanism designer has access to a social welfare function and can commit to long-run contracts—assumptions that are difficult to satisfy in democratic settings where the "mechanism designer" is the electorate itself. TATSUKI differs in two respects: first, the incentive structure is transparent and parameterized through the publicly known influence function ω(S), enabling democratic deliberation over the mechanism's parameters; second, the evaluation is based on observable pledge fulfillment rather than unobservable social welfare.</w:t>
       </w:r>
     </w:p>
     <w:p>
@@ -207,17 +212,22 @@
     </w:p>
     <w:p>
       <w:r>
-        <w:t>Quadratic Voting (Lalley &amp; Weyl, 2018; Posner &amp; Weyl, 2018) allows voters to express preference intensity by purchasing votes at quadratic cost, achieving approximate welfare optimality under certain conditions. While QV modifies the voting act itself, TATSUKI modifies the consequences of past voting outcomes. The two mechanisms are formally complementary and could, in principle, be combined.</w:t>
+        <w:t>Several recent proposals modify the electoral process to address different democratic deficits. Quadratic Voting (QV; Lalley &amp; Weyl, 2018; Posner &amp; Weyl, 2018) addresses the failure to capture preference intensity by allowing voters to purchase additional votes at quadratic cost, achieving approximate welfare optimality under certain conditions. QV modifies the voting act itself (how preferences are expressed), while TATSUKI modifies the consequences of past voting outcomes (how performance is sanctioned). Critically, QV provides no mechanism for holding elected representatives accountable after the election; once votes are cast, the incentive structure ends. TATSUKI extends the incentive horizon beyond election day. The two mechanisms are formally complementary: QV could govern the election, while TATSUKI governs the subsequent accountability cycle.</w:t>
       </w:r>
     </w:p>
     <w:p>
       <w:r>
-        <w:t>Liquid democracy (Brill et al., 2022; Christoff &amp; Grossi, 2017; Kahng et al., 2021) enables transitive delegation of voting rights, dissolving the boundary between direct and representative democracy. In contrast, TATSUKI preserves the representative structure while strengthening accountability within it. Futarchy (Hanson, 2013) delegates policy decisions to prediction markets, separating values from beliefs. TATSUKI implements a different separation: pre-election pledges from post-election evaluation.</w:t>
+        <w:t>Liquid democracy (Brill et al., 2022; Christoff &amp; Grossi, 2017; Kahng et al., 2021) enables transitive delegation of voting rights, dissolving the boundary between direct and representative democracy. This addresses the representation problem (who decides?) but not the accountability problem (what happens when representatives fail to deliver?). In liquid democracy, a poorly performing delegate can be re-delegated, but there is no structured mechanism for evaluating whether delegated decisions fulfilled voters' expressed preferences. TATSUKI preserves the representative structure while addressing this accountability gap directly.</w:t>
       </w:r>
     </w:p>
     <w:p>
       <w:r>
-        <w:t>More recently, Koster et al. (2022) demonstrate the potential of computational approaches to democratic mechanism design, using reinforcement learning to discover tax policies preferred by human participants. Their work underscores the value of simulation-based methods for evaluating institutional designs before real-world implementation—a methodological parallel to our ABM-based approach.</w:t>
+        <w:t>Futarchy (Hanson, 2013) delegates policy decisions to prediction markets, separating values from beliefs. This approach relies on the efficient market hypothesis to aggregate dispersed information, but faces practical challenges including thin markets, manipulation vulnerability, and the difficulty of specifying welfare metrics ex ante. TATSUKI implements a different separation—pre-election pledges from post-election evaluation—that relies on observable pledge fulfillment rather than market-derived forecasts.</w:t>
+      </w:r>
+    </w:p>
+    <w:p>
+      <w:r>
+        <w:t>More recently, Koster et al. (2022) demonstrate the potential of computational approaches to democratic mechanism design, using reinforcement learning to discover tax policies preferred by human participants. Their work establishes that AI-assisted institutional design can outperform conventional mechanisms in laboratory settings. However, their approach requires a centralized computational agent to learn and implement policies—a design that raises questions about democratic legitimacy and transparency. TATSUKI complements this line of work by providing a transparent, parameterized mechanism whose properties can be analyzed and debated before implementation, while using simulation (ABM) rather than deployment to evaluate outcomes.</w:t>
       </w:r>
     </w:p>
     <w:p>
@@ -230,7 +240,12 @@
     </w:p>
     <w:p>
       <w:r>
-        <w:t>Thomson et al. (2017) conduct the most comprehensive comparative study of pledge fulfillment, analyzing over 20,000 pledges across 57 election campaigns in 12 countries. They find that governing parties fulfill a majority of pledges, with single-party governments achieving higher rates than coalitions. Naurin, Royed, and Thomson (2020) further document cross-national variation. Bytzek et al. (2024) demonstrate that pledge fulfillment perceptions significantly affect political trust. These findings provide the empirical foundation for TATSUKI's core assumption that pledge fulfillment can be systematically measured and used as an institutional input.</w:t>
+        <w:t>The empirical literature on pledge fulfillment has matured substantially over the past two decades, creating a data infrastructure that was unavailable when earlier accountability mechanisms were proposed. Thomson et al. (2017) conduct the most comprehensive comparative study, analyzing over 20,000 pledges across 57 election campaigns in 12 countries. They find that governing parties fulfill a majority of pledges, with single-party governments achieving higher rates than coalitions. Naurin, Royed, and Thomson (2020) further document cross-national variation, establishing that pledge fulfillment is not an artifact of particular political systems but a generalizable phenomenon.</w:t>
+      </w:r>
+    </w:p>
+    <w:p>
+      <w:r>
+        <w:t>Bytzek et al. (2024) demonstrate that pledge fulfillment perceptions significantly affect political trust, providing evidence for the behavioral link that TATSUKI institutionalizes: citizens respond to perceived fulfillment, and this response can be channeled through structured institutional mechanisms. Crucially, the availability of systematic pledge-tracking infrastructure—exemplified by the Polimeter project (Pétry &amp; Fortier-Chouinard, 2024) and similar initiatives in multiple countries—means that the key empirical prerequisite for TATSUKI (reliable, independent fulfillment measurement) is now technically feasible at scale. This convergence of measurement capacity and institutional need is a central motivation for the present paper.</w:t>
       </w:r>
     </w:p>
     <w:p>
@@ -243,7 +258,989 @@
     </w:p>
     <w:p>
       <w:r>
-        <w:t>ABMs have been widely applied to electoral dynamics. Laver (2011) models party competition with strategic agents adapting to voter distributions. Mitra (2022) simulates district-based elections incorporating social and geographic influences. Tomlinson et al. (2024) employ replicator dynamics to study candidate positioning, finding that complex evolutionary dynamics emerge even from simple behavioral heuristics. Our ABM builds on this tradition by introducing the TATSUKI mechanism as the institutional context within which candidate strategies evolve.</w:t>
+        <w:t>ABMs have been widely applied to electoral dynamics. Laver (2011) models party competition with strategic agents adapting to voter distributions. Mitra (2022) simulates district-based elections incorporating social and geographic influences. Tomlinson et al. (2024) employ replicator dynamics to study candidate positioning, finding that complex evolutionary dynamics emerge even from simple behavioral heuristics. However, a common limitation of existing electoral ABMs is that they take the institutional rules as fixed and study agent adaptation within those rules. None of these models uses the ABM framework to evaluate a proposed institutional reform by simulating its dynamic effects over multiple electoral cycles, nor do they incorporate adversarial robustness testing. Our ABM builds on this tradition but serves a different purpose: rather than modeling behavior within existing institutions, we use ABM as an institutional design evaluation tool, simulating how TATSUKI changes the evolutionary landscape within which candidate strategies compete.</w:t>
+      </w:r>
+    </w:p>
+    <w:p>
+      <w:pPr>
+        <w:pStyle w:val="Heading2"/>
+      </w:pPr>
+      <w:r>
+        <w:t>2.6 Comparative Summary</w:t>
+      </w:r>
+    </w:p>
+    <w:p>
+      <w:r>
+        <w:t>Table 1 synthesizes the comparisons above along six dimensions that are central to the design and evaluation of democratic accountability mechanisms. The table highlights that TATSUKI occupies a distinctive position: it is the only proposal that (i) operates on the accountability dimension (post-election performance feedback), (ii) maintains formal compatibility with one-person-one-vote through candidate-centric trust, (iii) is grounded in empirical calibration using large-scale pledge fulfillment data, and (iv) has been subjected to systematic adversarial robustness testing.</w:t>
+      </w:r>
+    </w:p>
+    <w:tbl>
+      <w:tblPr>
+        <w:tblStyle w:val="TableGrid"/>
+        <w:tblW w:type="auto" w:w="0"/>
+        <w:jc w:val="center"/>
+        <w:tblLook w:firstColumn="1" w:firstRow="1" w:lastColumn="0" w:lastRow="0" w:noHBand="0" w:noVBand="1" w:val="04A0"/>
+      </w:tblPr>
+      <w:tblGrid>
+        <w:gridCol w:w="1234"/>
+        <w:gridCol w:w="1234"/>
+        <w:gridCol w:w="1234"/>
+        <w:gridCol w:w="1234"/>
+        <w:gridCol w:w="1234"/>
+        <w:gridCol w:w="1234"/>
+        <w:gridCol w:w="1234"/>
+      </w:tblGrid>
+      <w:tr>
+        <w:tc>
+          <w:tcPr>
+            <w:tcW w:type="dxa" w:w="1296"/>
+          </w:tcPr>
+          <w:p>
+            <w:r/>
+            <w:r>
+              <w:rPr>
+                <w:b/>
+                <w:sz w:val="16"/>
+              </w:rPr>
+              <w:t>Dimension</w:t>
+            </w:r>
+          </w:p>
+        </w:tc>
+        <w:tc>
+          <w:tcPr>
+            <w:tcW w:type="dxa" w:w="1224"/>
+          </w:tcPr>
+          <w:p>
+            <w:r/>
+            <w:r>
+              <w:rPr>
+                <w:b/>
+                <w:sz w:val="16"/>
+              </w:rPr>
+              <w:t>Retrospective</w:t>
+              <w:br/>
+              <w:t>voting</w:t>
+            </w:r>
+          </w:p>
+        </w:tc>
+        <w:tc>
+          <w:tcPr>
+            <w:tcW w:type="dxa" w:w="1224"/>
+          </w:tcPr>
+          <w:p>
+            <w:r/>
+            <w:r>
+              <w:rPr>
+                <w:b/>
+                <w:sz w:val="16"/>
+              </w:rPr>
+              <w:t>Quadratic</w:t>
+              <w:br/>
+              <w:t>Voting</w:t>
+            </w:r>
+          </w:p>
+        </w:tc>
+        <w:tc>
+          <w:tcPr>
+            <w:tcW w:type="dxa" w:w="1224"/>
+          </w:tcPr>
+          <w:p>
+            <w:r/>
+            <w:r>
+              <w:rPr>
+                <w:b/>
+                <w:sz w:val="16"/>
+              </w:rPr>
+              <w:t>Liquid</w:t>
+              <w:br/>
+              <w:t>democracy</w:t>
+            </w:r>
+          </w:p>
+        </w:tc>
+        <w:tc>
+          <w:tcPr>
+            <w:tcW w:type="dxa" w:w="1224"/>
+          </w:tcPr>
+          <w:p>
+            <w:r/>
+            <w:r>
+              <w:rPr>
+                <w:b/>
+                <w:sz w:val="16"/>
+              </w:rPr>
+              <w:t>Futarchy</w:t>
+            </w:r>
+          </w:p>
+        </w:tc>
+        <w:tc>
+          <w:tcPr>
+            <w:tcW w:type="dxa" w:w="1224"/>
+          </w:tcPr>
+          <w:p>
+            <w:r/>
+            <w:r>
+              <w:rPr>
+                <w:b/>
+                <w:sz w:val="16"/>
+              </w:rPr>
+              <w:t>Democratic</w:t>
+              <w:br/>
+              <w:t>AI</w:t>
+            </w:r>
+          </w:p>
+        </w:tc>
+        <w:tc>
+          <w:tcPr>
+            <w:tcW w:type="dxa" w:w="1224"/>
+          </w:tcPr>
+          <w:p>
+            <w:r/>
+            <w:r>
+              <w:rPr>
+                <w:b/>
+                <w:sz w:val="16"/>
+              </w:rPr>
+              <w:t>TATSUKI</w:t>
+            </w:r>
+          </w:p>
+        </w:tc>
+      </w:tr>
+      <w:tr>
+        <w:tc>
+          <w:tcPr>
+            <w:tcW w:type="dxa" w:w="1296"/>
+          </w:tcPr>
+          <w:p>
+            <w:r/>
+            <w:r>
+              <w:rPr>
+                <w:b/>
+                <w:sz w:val="16"/>
+              </w:rPr>
+              <w:t>What is</w:t>
+              <w:br/>
+              <w:t>modified</w:t>
+            </w:r>
+          </w:p>
+        </w:tc>
+        <w:tc>
+          <w:tcPr>
+            <w:tcW w:type="dxa" w:w="1224"/>
+          </w:tcPr>
+          <w:p>
+            <w:r/>
+            <w:r>
+              <w:rPr>
+                <w:sz w:val="16"/>
+              </w:rPr>
+              <w:t>Voter</w:t>
+              <w:br/>
+              <w:t>cognition</w:t>
+              <w:br/>
+              <w:t>(informal)</w:t>
+            </w:r>
+          </w:p>
+        </w:tc>
+        <w:tc>
+          <w:tcPr>
+            <w:tcW w:type="dxa" w:w="1224"/>
+          </w:tcPr>
+          <w:p>
+            <w:r/>
+            <w:r>
+              <w:rPr>
+                <w:sz w:val="16"/>
+              </w:rPr>
+              <w:t>Vote counting</w:t>
+              <w:br/>
+              <w:t>(preference</w:t>
+              <w:br/>
+              <w:t>intensity)</w:t>
+            </w:r>
+          </w:p>
+        </w:tc>
+        <w:tc>
+          <w:tcPr>
+            <w:tcW w:type="dxa" w:w="1224"/>
+          </w:tcPr>
+          <w:p>
+            <w:r/>
+            <w:r>
+              <w:rPr>
+                <w:sz w:val="16"/>
+              </w:rPr>
+              <w:t>Delegation</w:t>
+              <w:br/>
+              <w:t>structure</w:t>
+            </w:r>
+          </w:p>
+        </w:tc>
+        <w:tc>
+          <w:tcPr>
+            <w:tcW w:type="dxa" w:w="1224"/>
+          </w:tcPr>
+          <w:p>
+            <w:r/>
+            <w:r>
+              <w:rPr>
+                <w:sz w:val="16"/>
+              </w:rPr>
+              <w:t>Policy</w:t>
+              <w:br/>
+              <w:t>selection</w:t>
+              <w:br/>
+              <w:t>(markets)</w:t>
+            </w:r>
+          </w:p>
+        </w:tc>
+        <w:tc>
+          <w:tcPr>
+            <w:tcW w:type="dxa" w:w="1224"/>
+          </w:tcPr>
+          <w:p>
+            <w:r/>
+            <w:r>
+              <w:rPr>
+                <w:sz w:val="16"/>
+              </w:rPr>
+              <w:t>Policy design</w:t>
+              <w:br/>
+              <w:t>(RL agent)</w:t>
+            </w:r>
+          </w:p>
+        </w:tc>
+        <w:tc>
+          <w:tcPr>
+            <w:tcW w:type="dxa" w:w="1224"/>
+          </w:tcPr>
+          <w:p>
+            <w:r/>
+            <w:r>
+              <w:rPr>
+                <w:sz w:val="16"/>
+              </w:rPr>
+              <w:t>Accountability</w:t>
+              <w:br/>
+              <w:t>loop</w:t>
+              <w:br/>
+              <w:t>(trust coeff.)</w:t>
+            </w:r>
+          </w:p>
+        </w:tc>
+      </w:tr>
+      <w:tr>
+        <w:tc>
+          <w:tcPr>
+            <w:tcW w:type="dxa" w:w="1296"/>
+          </w:tcPr>
+          <w:p>
+            <w:r/>
+            <w:r>
+              <w:rPr>
+                <w:b/>
+                <w:sz w:val="16"/>
+              </w:rPr>
+              <w:t>Temporal</w:t>
+              <w:br/>
+              <w:t>focus</w:t>
+            </w:r>
+          </w:p>
+        </w:tc>
+        <w:tc>
+          <w:tcPr>
+            <w:tcW w:type="dxa" w:w="1224"/>
+          </w:tcPr>
+          <w:p>
+            <w:r/>
+            <w:r>
+              <w:rPr>
+                <w:sz w:val="16"/>
+              </w:rPr>
+              <w:t>Retrospective</w:t>
+              <w:br/>
+              <w:t>(single election)</w:t>
+            </w:r>
+          </w:p>
+        </w:tc>
+        <w:tc>
+          <w:tcPr>
+            <w:tcW w:type="dxa" w:w="1224"/>
+          </w:tcPr>
+          <w:p>
+            <w:r/>
+            <w:r>
+              <w:rPr>
+                <w:sz w:val="16"/>
+              </w:rPr>
+              <w:t>Single</w:t>
+              <w:br/>
+              <w:t>election</w:t>
+            </w:r>
+          </w:p>
+        </w:tc>
+        <w:tc>
+          <w:tcPr>
+            <w:tcW w:type="dxa" w:w="1224"/>
+          </w:tcPr>
+          <w:p>
+            <w:r/>
+            <w:r>
+              <w:rPr>
+                <w:sz w:val="16"/>
+              </w:rPr>
+              <w:t>Continuous</w:t>
+              <w:br/>
+              <w:t>(re-delegation)</w:t>
+            </w:r>
+          </w:p>
+        </w:tc>
+        <w:tc>
+          <w:tcPr>
+            <w:tcW w:type="dxa" w:w="1224"/>
+          </w:tcPr>
+          <w:p>
+            <w:r/>
+            <w:r>
+              <w:rPr>
+                <w:sz w:val="16"/>
+              </w:rPr>
+              <w:t>Prospective</w:t>
+              <w:br/>
+              <w:t>(prediction)</w:t>
+            </w:r>
+          </w:p>
+        </w:tc>
+        <w:tc>
+          <w:tcPr>
+            <w:tcW w:type="dxa" w:w="1224"/>
+          </w:tcPr>
+          <w:p>
+            <w:r/>
+            <w:r>
+              <w:rPr>
+                <w:sz w:val="16"/>
+              </w:rPr>
+              <w:t>Prospective</w:t>
+              <w:br/>
+              <w:t>(optimization)</w:t>
+            </w:r>
+          </w:p>
+        </w:tc>
+        <w:tc>
+          <w:tcPr>
+            <w:tcW w:type="dxa" w:w="1224"/>
+          </w:tcPr>
+          <w:p>
+            <w:r/>
+            <w:r>
+              <w:rPr>
+                <w:sz w:val="16"/>
+              </w:rPr>
+              <w:t>Retrospective +</w:t>
+              <w:br/>
+              <w:t>continuous</w:t>
+              <w:br/>
+              <w:t>(multi-term)</w:t>
+            </w:r>
+          </w:p>
+        </w:tc>
+      </w:tr>
+      <w:tr>
+        <w:tc>
+          <w:tcPr>
+            <w:tcW w:type="dxa" w:w="1296"/>
+          </w:tcPr>
+          <w:p>
+            <w:r/>
+            <w:r>
+              <w:rPr>
+                <w:b/>
+                <w:sz w:val="16"/>
+              </w:rPr>
+              <w:t>OPOV</w:t>
+              <w:br/>
+              <w:t>compatible</w:t>
+            </w:r>
+          </w:p>
+        </w:tc>
+        <w:tc>
+          <w:tcPr>
+            <w:tcW w:type="dxa" w:w="1224"/>
+          </w:tcPr>
+          <w:p>
+            <w:r/>
+            <w:r>
+              <w:rPr>
+                <w:sz w:val="16"/>
+              </w:rPr>
+              <w:t>Yes</w:t>
+            </w:r>
+          </w:p>
+        </w:tc>
+        <w:tc>
+          <w:tcPr>
+            <w:tcW w:type="dxa" w:w="1224"/>
+          </w:tcPr>
+          <w:p>
+            <w:r/>
+            <w:r>
+              <w:rPr>
+                <w:sz w:val="16"/>
+              </w:rPr>
+              <w:t>Modified</w:t>
+              <w:br/>
+              <w:t>(cost-based)</w:t>
+            </w:r>
+          </w:p>
+        </w:tc>
+        <w:tc>
+          <w:tcPr>
+            <w:tcW w:type="dxa" w:w="1224"/>
+          </w:tcPr>
+          <w:p>
+            <w:r/>
+            <w:r>
+              <w:rPr>
+                <w:sz w:val="16"/>
+              </w:rPr>
+              <w:t>Modified</w:t>
+              <w:br/>
+              <w:t>(delegation)</w:t>
+            </w:r>
+          </w:p>
+        </w:tc>
+        <w:tc>
+          <w:tcPr>
+            <w:tcW w:type="dxa" w:w="1224"/>
+          </w:tcPr>
+          <w:p>
+            <w:r/>
+            <w:r>
+              <w:rPr>
+                <w:sz w:val="16"/>
+              </w:rPr>
+              <w:t>N/A</w:t>
+              <w:br/>
+              <w:t>(market-based)</w:t>
+            </w:r>
+          </w:p>
+        </w:tc>
+        <w:tc>
+          <w:tcPr>
+            <w:tcW w:type="dxa" w:w="1224"/>
+          </w:tcPr>
+          <w:p>
+            <w:r/>
+            <w:r>
+              <w:rPr>
+                <w:sz w:val="16"/>
+              </w:rPr>
+              <w:t>N/A</w:t>
+              <w:br/>
+              <w:t>(centralized)</w:t>
+            </w:r>
+          </w:p>
+        </w:tc>
+        <w:tc>
+          <w:tcPr>
+            <w:tcW w:type="dxa" w:w="1224"/>
+          </w:tcPr>
+          <w:p>
+            <w:r/>
+            <w:r>
+              <w:rPr>
+                <w:sz w:val="16"/>
+              </w:rPr>
+              <w:t>Yes</w:t>
+              <w:br/>
+              <w:t>(candidate-</w:t>
+              <w:br/>
+              <w:t>centric)</w:t>
+            </w:r>
+          </w:p>
+        </w:tc>
+      </w:tr>
+      <w:tr>
+        <w:tc>
+          <w:tcPr>
+            <w:tcW w:type="dxa" w:w="1296"/>
+          </w:tcPr>
+          <w:p>
+            <w:r/>
+            <w:r>
+              <w:rPr>
+                <w:b/>
+                <w:sz w:val="16"/>
+              </w:rPr>
+              <w:t>Accountability</w:t>
+              <w:br/>
+              <w:t>mechanism</w:t>
+            </w:r>
+          </w:p>
+        </w:tc>
+        <w:tc>
+          <w:tcPr>
+            <w:tcW w:type="dxa" w:w="1224"/>
+          </w:tcPr>
+          <w:p>
+            <w:r/>
+            <w:r>
+              <w:rPr>
+                <w:sz w:val="16"/>
+              </w:rPr>
+              <w:t>Subjective</w:t>
+              <w:br/>
+              <w:t>voter judgment</w:t>
+            </w:r>
+          </w:p>
+        </w:tc>
+        <w:tc>
+          <w:tcPr>
+            <w:tcW w:type="dxa" w:w="1224"/>
+          </w:tcPr>
+          <w:p>
+            <w:r/>
+            <w:r>
+              <w:rPr>
+                <w:sz w:val="16"/>
+              </w:rPr>
+              <w:t>None</w:t>
+              <w:br/>
+              <w:t>(post-election)</w:t>
+            </w:r>
+          </w:p>
+        </w:tc>
+        <w:tc>
+          <w:tcPr>
+            <w:tcW w:type="dxa" w:w="1224"/>
+          </w:tcPr>
+          <w:p>
+            <w:r/>
+            <w:r>
+              <w:rPr>
+                <w:sz w:val="16"/>
+              </w:rPr>
+              <w:t>Re-delegation</w:t>
+              <w:br/>
+              <w:t>(no evaluation)</w:t>
+            </w:r>
+          </w:p>
+        </w:tc>
+        <w:tc>
+          <w:tcPr>
+            <w:tcW w:type="dxa" w:w="1224"/>
+          </w:tcPr>
+          <w:p>
+            <w:r/>
+            <w:r>
+              <w:rPr>
+                <w:sz w:val="16"/>
+              </w:rPr>
+              <w:t>Market price</w:t>
+              <w:br/>
+              <w:t>convergence</w:t>
+            </w:r>
+          </w:p>
+        </w:tc>
+        <w:tc>
+          <w:tcPr>
+            <w:tcW w:type="dxa" w:w="1224"/>
+          </w:tcPr>
+          <w:p>
+            <w:r/>
+            <w:r>
+              <w:rPr>
+                <w:sz w:val="16"/>
+              </w:rPr>
+              <w:t>RL reward</w:t>
+              <w:br/>
+              <w:t>signal</w:t>
+            </w:r>
+          </w:p>
+        </w:tc>
+        <w:tc>
+          <w:tcPr>
+            <w:tcW w:type="dxa" w:w="1224"/>
+          </w:tcPr>
+          <w:p>
+            <w:r/>
+            <w:r>
+              <w:rPr>
+                <w:sz w:val="16"/>
+              </w:rPr>
+              <w:t>Third-party</w:t>
+              <w:br/>
+              <w:t>structured</w:t>
+              <w:br/>
+              <w:t>evaluation</w:t>
+            </w:r>
+          </w:p>
+        </w:tc>
+      </w:tr>
+      <w:tr>
+        <w:tc>
+          <w:tcPr>
+            <w:tcW w:type="dxa" w:w="1296"/>
+          </w:tcPr>
+          <w:p>
+            <w:r/>
+            <w:r>
+              <w:rPr>
+                <w:b/>
+                <w:sz w:val="16"/>
+              </w:rPr>
+              <w:t>Empirical</w:t>
+              <w:br/>
+              <w:t>calibration</w:t>
+            </w:r>
+          </w:p>
+        </w:tc>
+        <w:tc>
+          <w:tcPr>
+            <w:tcW w:type="dxa" w:w="1224"/>
+          </w:tcPr>
+          <w:p>
+            <w:r/>
+            <w:r>
+              <w:rPr>
+                <w:sz w:val="16"/>
+              </w:rPr>
+              <w:t>Descriptive</w:t>
+              <w:br/>
+              <w:t>(observational)</w:t>
+            </w:r>
+          </w:p>
+        </w:tc>
+        <w:tc>
+          <w:tcPr>
+            <w:tcW w:type="dxa" w:w="1224"/>
+          </w:tcPr>
+          <w:p>
+            <w:r/>
+            <w:r>
+              <w:rPr>
+                <w:sz w:val="16"/>
+              </w:rPr>
+              <w:t>Lab</w:t>
+              <w:br/>
+              <w:t>experiments</w:t>
+            </w:r>
+          </w:p>
+        </w:tc>
+        <w:tc>
+          <w:tcPr>
+            <w:tcW w:type="dxa" w:w="1224"/>
+          </w:tcPr>
+          <w:p>
+            <w:r/>
+            <w:r>
+              <w:rPr>
+                <w:sz w:val="16"/>
+              </w:rPr>
+              <w:t>Theoretical</w:t>
+              <w:br/>
+              <w:t>only</w:t>
+            </w:r>
+          </w:p>
+        </w:tc>
+        <w:tc>
+          <w:tcPr>
+            <w:tcW w:type="dxa" w:w="1224"/>
+          </w:tcPr>
+          <w:p>
+            <w:r/>
+            <w:r>
+              <w:rPr>
+                <w:sz w:val="16"/>
+              </w:rPr>
+              <w:t>Theoretical</w:t>
+              <w:br/>
+              <w:t>only</w:t>
+            </w:r>
+          </w:p>
+        </w:tc>
+        <w:tc>
+          <w:tcPr>
+            <w:tcW w:type="dxa" w:w="1224"/>
+          </w:tcPr>
+          <w:p>
+            <w:r/>
+            <w:r>
+              <w:rPr>
+                <w:sz w:val="16"/>
+              </w:rPr>
+              <w:t>Lab</w:t>
+              <w:br/>
+              <w:t>experiments</w:t>
+            </w:r>
+          </w:p>
+        </w:tc>
+        <w:tc>
+          <w:tcPr>
+            <w:tcW w:type="dxa" w:w="1224"/>
+          </w:tcPr>
+          <w:p>
+            <w:r/>
+            <w:r>
+              <w:rPr>
+                <w:sz w:val="16"/>
+              </w:rPr>
+              <w:t>Yes</w:t>
+              <w:br/>
+              <w:t>(Polimeter +</w:t>
+              <w:br/>
+              <w:t>Thomson)</w:t>
+            </w:r>
+          </w:p>
+        </w:tc>
+      </w:tr>
+      <w:tr>
+        <w:tc>
+          <w:tcPr>
+            <w:tcW w:type="dxa" w:w="1296"/>
+          </w:tcPr>
+          <w:p>
+            <w:r/>
+            <w:r>
+              <w:rPr>
+                <w:b/>
+                <w:sz w:val="16"/>
+              </w:rPr>
+              <w:t>Manipulation</w:t>
+              <w:br/>
+              <w:t>resistance</w:t>
+            </w:r>
+          </w:p>
+        </w:tc>
+        <w:tc>
+          <w:tcPr>
+            <w:tcW w:type="dxa" w:w="1224"/>
+          </w:tcPr>
+          <w:p>
+            <w:r/>
+            <w:r>
+              <w:rPr>
+                <w:sz w:val="16"/>
+              </w:rPr>
+              <w:t>Low</w:t>
+              <w:br/>
+              <w:t>(voter myopia)</w:t>
+            </w:r>
+          </w:p>
+        </w:tc>
+        <w:tc>
+          <w:tcPr>
+            <w:tcW w:type="dxa" w:w="1224"/>
+          </w:tcPr>
+          <w:p>
+            <w:r/>
+            <w:r>
+              <w:rPr>
+                <w:sz w:val="16"/>
+              </w:rPr>
+              <w:t>Moderate</w:t>
+              <w:br/>
+              <w:t>(quadratic cost)</w:t>
+            </w:r>
+          </w:p>
+        </w:tc>
+        <w:tc>
+          <w:tcPr>
+            <w:tcW w:type="dxa" w:w="1224"/>
+          </w:tcPr>
+          <w:p>
+            <w:r/>
+            <w:r>
+              <w:rPr>
+                <w:sz w:val="16"/>
+              </w:rPr>
+              <w:t>Low</w:t>
+              <w:br/>
+              <w:t>(delegation</w:t>
+              <w:br/>
+              <w:t>chains)</w:t>
+            </w:r>
+          </w:p>
+        </w:tc>
+        <w:tc>
+          <w:tcPr>
+            <w:tcW w:type="dxa" w:w="1224"/>
+          </w:tcPr>
+          <w:p>
+            <w:r/>
+            <w:r>
+              <w:rPr>
+                <w:sz w:val="16"/>
+              </w:rPr>
+              <w:t>Moderate</w:t>
+              <w:br/>
+              <w:t>(market</w:t>
+              <w:br/>
+              <w:t>liquidity)</w:t>
+            </w:r>
+          </w:p>
+        </w:tc>
+        <w:tc>
+          <w:tcPr>
+            <w:tcW w:type="dxa" w:w="1224"/>
+          </w:tcPr>
+          <w:p>
+            <w:r/>
+            <w:r>
+              <w:rPr>
+                <w:sz w:val="16"/>
+              </w:rPr>
+              <w:t>Unknown</w:t>
+              <w:br/>
+              <w:t>(centralized)</w:t>
+            </w:r>
+          </w:p>
+        </w:tc>
+        <w:tc>
+          <w:tcPr>
+            <w:tcW w:type="dxa" w:w="1224"/>
+          </w:tcPr>
+          <w:p>
+            <w:r/>
+            <w:r>
+              <w:rPr>
+                <w:sz w:val="16"/>
+              </w:rPr>
+              <w:t>Tested</w:t>
+              <w:br/>
+              <w:t>(GA adversarial</w:t>
+              <w:br/>
+              <w:t>analysis)</w:t>
+            </w:r>
+          </w:p>
+        </w:tc>
+      </w:tr>
+      <w:tr>
+        <w:tc>
+          <w:tcPr>
+            <w:tcW w:type="dxa" w:w="1296"/>
+          </w:tcPr>
+          <w:p>
+            <w:r/>
+            <w:r>
+              <w:rPr>
+                <w:b/>
+                <w:sz w:val="16"/>
+              </w:rPr>
+              <w:t>Pledge</w:t>
+              <w:br/>
+              <w:t>specificity</w:t>
+            </w:r>
+          </w:p>
+        </w:tc>
+        <w:tc>
+          <w:tcPr>
+            <w:tcW w:type="dxa" w:w="1224"/>
+          </w:tcPr>
+          <w:p>
+            <w:r/>
+            <w:r>
+              <w:rPr>
+                <w:sz w:val="16"/>
+              </w:rPr>
+              <w:t>Not required</w:t>
+            </w:r>
+          </w:p>
+        </w:tc>
+        <w:tc>
+          <w:tcPr>
+            <w:tcW w:type="dxa" w:w="1224"/>
+          </w:tcPr>
+          <w:p>
+            <w:r/>
+            <w:r>
+              <w:rPr>
+                <w:sz w:val="16"/>
+              </w:rPr>
+              <w:t>Not required</w:t>
+            </w:r>
+          </w:p>
+        </w:tc>
+        <w:tc>
+          <w:tcPr>
+            <w:tcW w:type="dxa" w:w="1224"/>
+          </w:tcPr>
+          <w:p>
+            <w:r/>
+            <w:r>
+              <w:rPr>
+                <w:sz w:val="16"/>
+              </w:rPr>
+              <w:t>Not required</w:t>
+            </w:r>
+          </w:p>
+        </w:tc>
+        <w:tc>
+          <w:tcPr>
+            <w:tcW w:type="dxa" w:w="1224"/>
+          </w:tcPr>
+          <w:p>
+            <w:r/>
+            <w:r>
+              <w:rPr>
+                <w:sz w:val="16"/>
+              </w:rPr>
+              <w:t>Defined via</w:t>
+              <w:br/>
+              <w:t>market contract</w:t>
+            </w:r>
+          </w:p>
+        </w:tc>
+        <w:tc>
+          <w:tcPr>
+            <w:tcW w:type="dxa" w:w="1224"/>
+          </w:tcPr>
+          <w:p>
+            <w:r/>
+            <w:r>
+              <w:rPr>
+                <w:sz w:val="16"/>
+              </w:rPr>
+              <w:t>Not required</w:t>
+            </w:r>
+          </w:p>
+        </w:tc>
+        <w:tc>
+          <w:tcPr>
+            <w:tcW w:type="dxa" w:w="1224"/>
+          </w:tcPr>
+          <w:p>
+            <w:r/>
+            <w:r>
+              <w:rPr>
+                <w:sz w:val="16"/>
+              </w:rPr>
+              <w:t>Required</w:t>
+              <w:br/>
+              <w:t>(weighted</w:t>
+              <w:br/>
+              <w:t>portfolio)</w:t>
+            </w:r>
+          </w:p>
+        </w:tc>
+      </w:tr>
+    </w:tbl>
+    <w:p>
+      <w:pPr>
+        <w:spacing w:before="120" w:after="240"/>
+        <w:jc w:val="center"/>
+      </w:pPr>
+      <w:r>
+        <w:rPr>
+          <w:i/>
+          <w:sz w:val="20"/>
+        </w:rPr>
+        <w:t>Table 1. Comparative summary of TATSUKI and related approaches across six design dimensions. TATSUKI uniquely combines retrospective accountability, OPOV compatibility, empirical calibration, and adversarial robustness testing.</w:t>
+      </w:r>
+    </w:p>
+    <w:p>
+      <w:r>
+        <w:t>The comparison reveals that existing proposals address different democratic deficits—preference expression (QV), delegation flexibility (liquid democracy), information aggregation (futarchy), or computational policy optimization (Democratic AI)—but none directly institutionalizes the retrospective accountability relationship between pre-election promises and post-election performance. This gap is particularly significant given the empirical evidence that pledge fulfillment is both measurable (Thomson et al., 2017) and consequential for political trust (Bytzek et al., 2024). TATSUKI is designed to fill precisely this gap. Figure 1 visualizes this positioning, mapping each proposal along the dimensions of temporal orientation (retrospective to prospective) and departure from one-person-one-vote.</w:t>
       </w:r>
     </w:p>
     <w:p>

</xml_diff>

<commit_message>
Add 'Temporal Democracy Deficit' discussion and cover letter framing
- Section 6.5 rewritten as 'The Temporal Democracy Deficit':
  - Frames core problem: voters can only express will at election time
  - Explicitly shows how QV, liquid democracy, futarchy, Democratic AI
    each fail to resolve this temporal mismatch
  - Shows how TATSUKI transforms one-time electoral choice into
    continuous institutional commitment via trust coefficient
  - Passive suffrage asymmetry retained as secondary point
- Cover letter 'why now' restructured:
  - Leads with temporal democracy deficit as structural problem
  - Shows existing reforms' limitations against this problem
  - Three converging trends as enabling conditions

Co-Authored-By: Tatsuki Onishi <bougtoir@gmail.com>
</commit_message>
<xml_diff>
--- a/tasuki-electoral-model/output/docx/TATSUKI_SSR_English.docx
+++ b/tasuki-electoral-model/output/docx/TATSUKI_SSR_English.docx
@@ -2211,22 +2211,27 @@
         <w:pStyle w:val="Heading2"/>
       </w:pPr>
       <w:r>
-        <w:t>6.5 The Asymmetry of Electoral Participation Encouragement</w:t>
+        <w:t>6.5 The Temporal Democracy Deficit</w:t>
       </w:r>
     </w:p>
     <w:p>
       <w:r>
-        <w:t>A broader motivation underlying the TATSUKI proposal deserves explicit articulation. In many democracies, government-sponsored electoral participation campaigns focus almost exclusively on encouraging citizens to exercise their right to vote—that is, the suffrage right. Remarkably little institutional effort is directed toward encouraging citizens to exercise their right to stand for election—the candidacy right (passive suffrage). This asymmetry is striking: both rights are constitutionally guaranteed in most democratic systems, yet public discourse and administrative practice treat the former as a civic duty while largely neglecting the latter.</w:t>
+        <w:t>A fundamental structural limitation of contemporary representative democracy deserves explicit articulation: citizens can express their political will only at the moment of voting, typically once every several years. Between elections, the formal channels for citizen influence on elected representatives are extremely limited. Voters choose a candidate, but once the ballot is cast, they possess no institutional mechanism to ensure that the promises motivating their choice are honored. The democratic feedback loop is, in effect, intermittent—operating at intervals of four to five years—while governance is continuous. This temporal mismatch is arguably the central structural weakness of modern representative democracy.</w:t>
       </w:r>
     </w:p>
     <w:p>
       <w:r>
-        <w:t>This imbalance reflects and reinforces a deeper structural limitation of contemporary representative democracy: citizens can express their political will only at the moment of voting, typically once every several years. Between elections, the formal channels for citizen influence on policy are extremely limited. The current system thus implicitly frames democratic participation as a periodic, passive act of selection rather than a continuous, active engagement with governance.</w:t>
+        <w:t>Recent electoral reform proposals address various democratic deficits, but none fully resolves this temporal mismatch. Quadratic voting (Lalley &amp; Weyl, 2018) enriches preference expression at election time, but provides no mechanism for post-election accountability: once votes are cast, the incentive structure terminates. Liquid democracy (Brill et al., 2022) enables continuous re-delegation, but this addresses the question of who decides, not whether decisions align with voters' expressed preferences. Futarchy (Hanson, 2013) operates continuously via prediction markets, but replaces democratic decision-making with market-based policy selection, raising concerns about democratic legitimacy. The computational approach of Koster et al. (2022) optimizes policies via reinforcement learning, but centralizes agency in an algorithmic designer rather than distributing it to citizens. In each case, the voter’s voice remains confined to a single moment—the act of choosing—without a structured mechanism to carry that voice forward into the governance period.</w:t>
       </w:r>
     </w:p>
     <w:p>
       <w:r>
-        <w:t>TATSUKI addresses this concern from two directions. First, by introducing a continuous accountability loop—where elected officials are evaluated on pledge fulfillment throughout their term—the mechanism extends the temporal scope of democratic engagement beyond the election day. Citizens' expressed preferences at the ballot box carry forward as binding benchmarks against which performance is measured, effectively giving their electoral voice a lasting institutional presence. Second, by making the consequences of candidacy more transparent and structured through the trust coefficient mechanism, TATSUKI may lower the perceived barriers to candidacy. When the rules governing electoral accountability are explicit and performance-based, the decision to stand for office becomes more predictable and less dependent on incumbency advantages or party gatekeeping. In this sense, TATSUKI aligns with the normative position that the right to stand for election deserves the same institutional encouragement as the right to vote.</w:t>
+        <w:t>TATSUKI directly addresses this temporal democracy deficit. By requiring candidates to declare weighted policy pledges before the election and institutionalizing systematic third-party evaluation after the term, TATSUKI transforms the voter’s one-time electoral choice into a lasting institutional commitment. Citizens' expressed preferences at the ballot box carry forward as binding benchmarks against which performance is measured, effectively giving their electoral voice a continuous institutional presence throughout the governance period. The trust coefficient τ = ω(S) encodes the result of this ongoing accountability relationship, ensuring that a candidate’s future electoral prospects are shaped by demonstrated fulfillment of the promises that earned their mandate.</w:t>
+      </w:r>
+    </w:p>
+    <w:p>
+      <w:r>
+        <w:t>This reframing also illuminates a related asymmetry in democratic participation encouragement. In many democracies, government-sponsored campaigns focus almost exclusively on encouraging citizens to exercise their right to vote (active suffrage). Remarkably little institutional effort is directed toward encouraging citizens to exercise their right to stand for election (passive suffrage). Both rights are constitutionally guaranteed, yet public discourse treats the former as a civic duty while largely neglecting the latter. TATSUKI may contribute to correcting this imbalance: by making the consequences of candidacy more transparent and performance-based through the trust coefficient mechanism, the decision to stand for office becomes more predictable and less dependent on incumbency advantages or party gatekeeping.</w:t>
       </w:r>
     </w:p>
     <w:p>

</xml_diff>